<commit_message>
Word hujjatni akademik formatga keltirish (Times New Roman 14pt, 1.5 interval, titul sahifa, ramkali jadval va diagrammalar)
</commit_message>
<xml_diff>
--- a/PIO_DMA_Mustaqil_ish.docx
+++ b/PIO_DMA_Mustaqil_ish.docx
@@ -104,13 +104,20 @@
       </w:r>
     </w:p>
     <w:p>
+      <w:r>
+        <w:br w:type="page"/>
+      </w:r>
+    </w:p>
+    <w:p>
       <w:pPr>
-        <w:spacing w:before="200" w:after="100"/>
+        <w:keepNext/>
+        <w:spacing w:before="240" w:after="120"/>
+        <w:jc w:val="left"/>
       </w:pPr>
       <w:r>
         <w:rPr>
           <w:b/>
-          <w:sz w:val="28"/>
+          <w:sz w:val="30"/>
         </w:rPr>
         <w:t xml:space="preserve">MUNDARIJA</w:t>
       </w:r>
@@ -201,12 +208,14 @@
     </w:p>
     <w:p>
       <w:pPr>
-        <w:spacing w:before="200" w:after="100"/>
+        <w:keepNext/>
+        <w:spacing w:before="240" w:after="120"/>
+        <w:jc w:val="left"/>
       </w:pPr>
       <w:r>
         <w:rPr>
           <w:b/>
-          <w:sz w:val="28"/>
+          <w:sz w:val="30"/>
         </w:rPr>
         <w:t xml:space="preserve">1. KIRISH</w:t>
       </w:r>
@@ -241,12 +250,14 @@
     </w:p>
     <w:p>
       <w:pPr>
-        <w:spacing w:before="200" w:after="100"/>
+        <w:keepNext/>
+        <w:spacing w:before="240" w:after="120"/>
+        <w:jc w:val="left"/>
       </w:pPr>
       <w:r>
         <w:rPr>
           <w:b/>
-          <w:sz w:val="28"/>
+          <w:sz w:val="30"/>
         </w:rPr>
         <w:t xml:space="preserve">2. MA'LUMOT KIRITISH-CHIQARISH (I/O) TUSHUNCHASI</w:t>
       </w:r>
@@ -288,12 +299,14 @@
     </w:p>
     <w:p>
       <w:pPr>
-        <w:spacing w:before="200" w:after="100"/>
+        <w:keepNext/>
+        <w:spacing w:before="240" w:after="120"/>
+        <w:jc w:val="left"/>
       </w:pPr>
       <w:r>
         <w:rPr>
           <w:b/>
-          <w:sz w:val="28"/>
+          <w:sz w:val="30"/>
         </w:rPr>
         <w:t xml:space="preserve">3. PIO (PROGRAMMED I/O) NIMA?</w:t>
       </w:r>
@@ -367,12 +380,14 @@
     </w:p>
     <w:p>
       <w:pPr>
-        <w:spacing w:before="200" w:after="100"/>
+        <w:keepNext/>
+        <w:spacing w:before="240" w:after="120"/>
+        <w:jc w:val="left"/>
       </w:pPr>
       <w:r>
         <w:rPr>
           <w:b/>
-          <w:sz w:val="28"/>
+          <w:sz w:val="30"/>
         </w:rPr>
         <w:t xml:space="preserve">4. DMA (DIRECT MEMORY ACCESS) NIMA?</w:t>
       </w:r>
@@ -460,12 +475,14 @@
     </w:p>
     <w:p>
       <w:pPr>
-        <w:spacing w:before="200" w:after="100"/>
+        <w:keepNext/>
+        <w:spacing w:before="240" w:after="120"/>
+        <w:jc w:val="left"/>
       </w:pPr>
       <w:r>
         <w:rPr>
           <w:b/>
-          <w:sz w:val="28"/>
+          <w:sz w:val="30"/>
         </w:rPr>
         <w:t xml:space="preserve">5. PIO ISH JARAYONI DIAGRAMMASI</w:t>
       </w:r>
@@ -479,8 +496,15 @@
     </w:p>
     <w:p>
       <w:pPr>
-        <w:spacing w:after="120"/>
+        <w:spacing w:after="160" w:line="240" w:lineRule="auto"/>
+        <w:pBdr>
+          <w:top w:val="single" w:sz="4" w:space="4" w:color="B0B0B0"/>
+          <w:left w:val="single" w:sz="4" w:space="4" w:color="B0B0B0"/>
+          <w:bottom w:val="single" w:sz="4" w:space="4" w:color="B0B0B0"/>
+          <w:right w:val="single" w:sz="4" w:space="4" w:color="B0B0B0"/>
+        </w:pBdr>
         <w:shd w:val="clear" w:fill="F2F2F2"/>
+        <w:jc w:val="left"/>
       </w:pPr>
       <w:r>
         <w:rPr>
@@ -492,6 +516,7 @@
       <w:r>
         <w:rPr>
           <w:rFonts w:ascii="Courier New" w:hAnsi="Courier New"/>
+          <w:sz w:val="18"/>
         </w:rPr>
         <w:br/>
       </w:r>
@@ -505,6 +530,7 @@
       <w:r>
         <w:rPr>
           <w:rFonts w:ascii="Courier New" w:hAnsi="Courier New"/>
+          <w:sz w:val="18"/>
         </w:rPr>
         <w:br/>
       </w:r>
@@ -518,6 +544,7 @@
       <w:r>
         <w:rPr>
           <w:rFonts w:ascii="Courier New" w:hAnsi="Courier New"/>
+          <w:sz w:val="18"/>
         </w:rPr>
         <w:br/>
       </w:r>
@@ -531,6 +558,7 @@
       <w:r>
         <w:rPr>
           <w:rFonts w:ascii="Courier New" w:hAnsi="Courier New"/>
+          <w:sz w:val="18"/>
         </w:rPr>
         <w:br/>
       </w:r>
@@ -544,6 +572,7 @@
       <w:r>
         <w:rPr>
           <w:rFonts w:ascii="Courier New" w:hAnsi="Courier New"/>
+          <w:sz w:val="18"/>
         </w:rPr>
         <w:br/>
       </w:r>
@@ -557,6 +586,7 @@
       <w:r>
         <w:rPr>
           <w:rFonts w:ascii="Courier New" w:hAnsi="Courier New"/>
+          <w:sz w:val="18"/>
         </w:rPr>
         <w:br/>
       </w:r>
@@ -570,6 +600,7 @@
       <w:r>
         <w:rPr>
           <w:rFonts w:ascii="Courier New" w:hAnsi="Courier New"/>
+          <w:sz w:val="18"/>
         </w:rPr>
         <w:br/>
       </w:r>
@@ -583,6 +614,7 @@
       <w:r>
         <w:rPr>
           <w:rFonts w:ascii="Courier New" w:hAnsi="Courier New"/>
+          <w:sz w:val="18"/>
         </w:rPr>
         <w:br/>
       </w:r>
@@ -596,6 +628,7 @@
       <w:r>
         <w:rPr>
           <w:rFonts w:ascii="Courier New" w:hAnsi="Courier New"/>
+          <w:sz w:val="18"/>
         </w:rPr>
         <w:br/>
       </w:r>
@@ -609,6 +642,7 @@
       <w:r>
         <w:rPr>
           <w:rFonts w:ascii="Courier New" w:hAnsi="Courier New"/>
+          <w:sz w:val="18"/>
         </w:rPr>
         <w:br/>
       </w:r>
@@ -622,6 +656,7 @@
       <w:r>
         <w:rPr>
           <w:rFonts w:ascii="Courier New" w:hAnsi="Courier New"/>
+          <w:sz w:val="18"/>
         </w:rPr>
         <w:br/>
       </w:r>
@@ -635,6 +670,7 @@
       <w:r>
         <w:rPr>
           <w:rFonts w:ascii="Courier New" w:hAnsi="Courier New"/>
+          <w:sz w:val="18"/>
         </w:rPr>
         <w:br/>
       </w:r>
@@ -648,6 +684,7 @@
       <w:r>
         <w:rPr>
           <w:rFonts w:ascii="Courier New" w:hAnsi="Courier New"/>
+          <w:sz w:val="18"/>
         </w:rPr>
         <w:br/>
       </w:r>
@@ -661,6 +698,7 @@
       <w:r>
         <w:rPr>
           <w:rFonts w:ascii="Courier New" w:hAnsi="Courier New"/>
+          <w:sz w:val="18"/>
         </w:rPr>
         <w:br/>
       </w:r>
@@ -674,6 +712,7 @@
       <w:r>
         <w:rPr>
           <w:rFonts w:ascii="Courier New" w:hAnsi="Courier New"/>
+          <w:sz w:val="18"/>
         </w:rPr>
         <w:br/>
       </w:r>
@@ -687,6 +726,7 @@
       <w:r>
         <w:rPr>
           <w:rFonts w:ascii="Courier New" w:hAnsi="Courier New"/>
+          <w:sz w:val="18"/>
         </w:rPr>
         <w:br/>
       </w:r>
@@ -700,6 +740,7 @@
       <w:r>
         <w:rPr>
           <w:rFonts w:ascii="Courier New" w:hAnsi="Courier New"/>
+          <w:sz w:val="18"/>
         </w:rPr>
         <w:br/>
       </w:r>
@@ -713,6 +754,7 @@
       <w:r>
         <w:rPr>
           <w:rFonts w:ascii="Courier New" w:hAnsi="Courier New"/>
+          <w:sz w:val="18"/>
         </w:rPr>
         <w:br/>
       </w:r>
@@ -726,6 +768,7 @@
       <w:r>
         <w:rPr>
           <w:rFonts w:ascii="Courier New" w:hAnsi="Courier New"/>
+          <w:sz w:val="18"/>
         </w:rPr>
         <w:br/>
       </w:r>
@@ -739,6 +782,7 @@
       <w:r>
         <w:rPr>
           <w:rFonts w:ascii="Courier New" w:hAnsi="Courier New"/>
+          <w:sz w:val="18"/>
         </w:rPr>
         <w:br/>
       </w:r>
@@ -752,6 +796,7 @@
       <w:r>
         <w:rPr>
           <w:rFonts w:ascii="Courier New" w:hAnsi="Courier New"/>
+          <w:sz w:val="18"/>
         </w:rPr>
         <w:br/>
       </w:r>
@@ -765,6 +810,7 @@
       <w:r>
         <w:rPr>
           <w:rFonts w:ascii="Courier New" w:hAnsi="Courier New"/>
+          <w:sz w:val="18"/>
         </w:rPr>
         <w:br/>
       </w:r>
@@ -778,6 +824,7 @@
       <w:r>
         <w:rPr>
           <w:rFonts w:ascii="Courier New" w:hAnsi="Courier New"/>
+          <w:sz w:val="18"/>
         </w:rPr>
         <w:br/>
       </w:r>
@@ -791,6 +838,7 @@
       <w:r>
         <w:rPr>
           <w:rFonts w:ascii="Courier New" w:hAnsi="Courier New"/>
+          <w:sz w:val="18"/>
         </w:rPr>
         <w:br/>
       </w:r>
@@ -804,6 +852,7 @@
       <w:r>
         <w:rPr>
           <w:rFonts w:ascii="Courier New" w:hAnsi="Courier New"/>
+          <w:sz w:val="18"/>
         </w:rPr>
         <w:br/>
       </w:r>
@@ -824,12 +873,14 @@
     </w:p>
     <w:p>
       <w:pPr>
-        <w:spacing w:before="200" w:after="100"/>
+        <w:keepNext/>
+        <w:spacing w:before="240" w:after="120"/>
+        <w:jc w:val="left"/>
       </w:pPr>
       <w:r>
         <w:rPr>
           <w:b/>
-          <w:sz w:val="28"/>
+          <w:sz w:val="30"/>
         </w:rPr>
         <w:t xml:space="preserve">6. DMA ISH JARAYONI DIAGRAMMASI</w:t>
       </w:r>
@@ -843,8 +894,15 @@
     </w:p>
     <w:p>
       <w:pPr>
-        <w:spacing w:after="120"/>
+        <w:spacing w:after="160" w:line="240" w:lineRule="auto"/>
+        <w:pBdr>
+          <w:top w:val="single" w:sz="4" w:space="4" w:color="B0B0B0"/>
+          <w:left w:val="single" w:sz="4" w:space="4" w:color="B0B0B0"/>
+          <w:bottom w:val="single" w:sz="4" w:space="4" w:color="B0B0B0"/>
+          <w:right w:val="single" w:sz="4" w:space="4" w:color="B0B0B0"/>
+        </w:pBdr>
         <w:shd w:val="clear" w:fill="F2F2F2"/>
+        <w:jc w:val="left"/>
       </w:pPr>
       <w:r>
         <w:rPr>
@@ -856,6 +914,7 @@
       <w:r>
         <w:rPr>
           <w:rFonts w:ascii="Courier New" w:hAnsi="Courier New"/>
+          <w:sz w:val="18"/>
         </w:rPr>
         <w:br/>
       </w:r>
@@ -869,6 +928,7 @@
       <w:r>
         <w:rPr>
           <w:rFonts w:ascii="Courier New" w:hAnsi="Courier New"/>
+          <w:sz w:val="18"/>
         </w:rPr>
         <w:br/>
       </w:r>
@@ -882,6 +942,7 @@
       <w:r>
         <w:rPr>
           <w:rFonts w:ascii="Courier New" w:hAnsi="Courier New"/>
+          <w:sz w:val="18"/>
         </w:rPr>
         <w:br/>
       </w:r>
@@ -895,6 +956,7 @@
       <w:r>
         <w:rPr>
           <w:rFonts w:ascii="Courier New" w:hAnsi="Courier New"/>
+          <w:sz w:val="18"/>
         </w:rPr>
         <w:br/>
       </w:r>
@@ -908,6 +970,7 @@
       <w:r>
         <w:rPr>
           <w:rFonts w:ascii="Courier New" w:hAnsi="Courier New"/>
+          <w:sz w:val="18"/>
         </w:rPr>
         <w:br/>
       </w:r>
@@ -921,6 +984,7 @@
       <w:r>
         <w:rPr>
           <w:rFonts w:ascii="Courier New" w:hAnsi="Courier New"/>
+          <w:sz w:val="18"/>
         </w:rPr>
         <w:br/>
       </w:r>
@@ -934,6 +998,7 @@
       <w:r>
         <w:rPr>
           <w:rFonts w:ascii="Courier New" w:hAnsi="Courier New"/>
+          <w:sz w:val="18"/>
         </w:rPr>
         <w:br/>
       </w:r>
@@ -947,6 +1012,7 @@
       <w:r>
         <w:rPr>
           <w:rFonts w:ascii="Courier New" w:hAnsi="Courier New"/>
+          <w:sz w:val="18"/>
         </w:rPr>
         <w:br/>
       </w:r>
@@ -960,6 +1026,7 @@
       <w:r>
         <w:rPr>
           <w:rFonts w:ascii="Courier New" w:hAnsi="Courier New"/>
+          <w:sz w:val="18"/>
         </w:rPr>
         <w:br/>
       </w:r>
@@ -973,6 +1040,7 @@
       <w:r>
         <w:rPr>
           <w:rFonts w:ascii="Courier New" w:hAnsi="Courier New"/>
+          <w:sz w:val="18"/>
         </w:rPr>
         <w:br/>
       </w:r>
@@ -986,6 +1054,7 @@
       <w:r>
         <w:rPr>
           <w:rFonts w:ascii="Courier New" w:hAnsi="Courier New"/>
+          <w:sz w:val="18"/>
         </w:rPr>
         <w:br/>
       </w:r>
@@ -999,6 +1068,7 @@
       <w:r>
         <w:rPr>
           <w:rFonts w:ascii="Courier New" w:hAnsi="Courier New"/>
+          <w:sz w:val="18"/>
         </w:rPr>
         <w:br/>
       </w:r>
@@ -1012,6 +1082,7 @@
       <w:r>
         <w:rPr>
           <w:rFonts w:ascii="Courier New" w:hAnsi="Courier New"/>
+          <w:sz w:val="18"/>
         </w:rPr>
         <w:br/>
       </w:r>
@@ -1025,6 +1096,7 @@
       <w:r>
         <w:rPr>
           <w:rFonts w:ascii="Courier New" w:hAnsi="Courier New"/>
+          <w:sz w:val="18"/>
         </w:rPr>
         <w:br/>
       </w:r>
@@ -1038,6 +1110,7 @@
       <w:r>
         <w:rPr>
           <w:rFonts w:ascii="Courier New" w:hAnsi="Courier New"/>
+          <w:sz w:val="18"/>
         </w:rPr>
         <w:br/>
       </w:r>
@@ -1051,6 +1124,7 @@
       <w:r>
         <w:rPr>
           <w:rFonts w:ascii="Courier New" w:hAnsi="Courier New"/>
+          <w:sz w:val="18"/>
         </w:rPr>
         <w:br/>
       </w:r>
@@ -1064,6 +1138,7 @@
       <w:r>
         <w:rPr>
           <w:rFonts w:ascii="Courier New" w:hAnsi="Courier New"/>
+          <w:sz w:val="18"/>
         </w:rPr>
         <w:br/>
       </w:r>
@@ -1077,6 +1152,7 @@
       <w:r>
         <w:rPr>
           <w:rFonts w:ascii="Courier New" w:hAnsi="Courier New"/>
+          <w:sz w:val="18"/>
         </w:rPr>
         <w:br/>
       </w:r>
@@ -1090,6 +1166,7 @@
       <w:r>
         <w:rPr>
           <w:rFonts w:ascii="Courier New" w:hAnsi="Courier New"/>
+          <w:sz w:val="18"/>
         </w:rPr>
         <w:br/>
       </w:r>
@@ -1103,6 +1180,7 @@
       <w:r>
         <w:rPr>
           <w:rFonts w:ascii="Courier New" w:hAnsi="Courier New"/>
+          <w:sz w:val="18"/>
         </w:rPr>
         <w:br/>
       </w:r>
@@ -1116,6 +1194,7 @@
       <w:r>
         <w:rPr>
           <w:rFonts w:ascii="Courier New" w:hAnsi="Courier New"/>
+          <w:sz w:val="18"/>
         </w:rPr>
         <w:br/>
       </w:r>
@@ -1129,6 +1208,7 @@
       <w:r>
         <w:rPr>
           <w:rFonts w:ascii="Courier New" w:hAnsi="Courier New"/>
+          <w:sz w:val="18"/>
         </w:rPr>
         <w:br/>
       </w:r>
@@ -1149,12 +1229,14 @@
     </w:p>
     <w:p>
       <w:pPr>
-        <w:spacing w:before="200" w:after="100"/>
+        <w:keepNext/>
+        <w:spacing w:before="240" w:after="120"/>
+        <w:jc w:val="left"/>
       </w:pPr>
       <w:r>
         <w:rPr>
           <w:b/>
-          <w:sz w:val="28"/>
+          <w:sz w:val="30"/>
         </w:rPr>
         <w:t xml:space="preserve">7. TIZIM ARXITEKTURASI (UMUMIY DIAGRAMMA)</w:t>
       </w:r>
@@ -1168,8 +1250,15 @@
     </w:p>
     <w:p>
       <w:pPr>
-        <w:spacing w:after="120"/>
+        <w:spacing w:after="160" w:line="240" w:lineRule="auto"/>
+        <w:pBdr>
+          <w:top w:val="single" w:sz="4" w:space="4" w:color="B0B0B0"/>
+          <w:left w:val="single" w:sz="4" w:space="4" w:color="B0B0B0"/>
+          <w:bottom w:val="single" w:sz="4" w:space="4" w:color="B0B0B0"/>
+          <w:right w:val="single" w:sz="4" w:space="4" w:color="B0B0B0"/>
+        </w:pBdr>
         <w:shd w:val="clear" w:fill="F2F2F2"/>
+        <w:jc w:val="left"/>
       </w:pPr>
       <w:r>
         <w:rPr>
@@ -1181,6 +1270,7 @@
       <w:r>
         <w:rPr>
           <w:rFonts w:ascii="Courier New" w:hAnsi="Courier New"/>
+          <w:sz w:val="18"/>
         </w:rPr>
         <w:br/>
       </w:r>
@@ -1194,6 +1284,7 @@
       <w:r>
         <w:rPr>
           <w:rFonts w:ascii="Courier New" w:hAnsi="Courier New"/>
+          <w:sz w:val="18"/>
         </w:rPr>
         <w:br/>
       </w:r>
@@ -1207,6 +1298,7 @@
       <w:r>
         <w:rPr>
           <w:rFonts w:ascii="Courier New" w:hAnsi="Courier New"/>
+          <w:sz w:val="18"/>
         </w:rPr>
         <w:br/>
       </w:r>
@@ -1220,6 +1312,7 @@
       <w:r>
         <w:rPr>
           <w:rFonts w:ascii="Courier New" w:hAnsi="Courier New"/>
+          <w:sz w:val="18"/>
         </w:rPr>
         <w:br/>
       </w:r>
@@ -1233,6 +1326,7 @@
       <w:r>
         <w:rPr>
           <w:rFonts w:ascii="Courier New" w:hAnsi="Courier New"/>
+          <w:sz w:val="18"/>
         </w:rPr>
         <w:br/>
       </w:r>
@@ -1246,6 +1340,7 @@
       <w:r>
         <w:rPr>
           <w:rFonts w:ascii="Courier New" w:hAnsi="Courier New"/>
+          <w:sz w:val="18"/>
         </w:rPr>
         <w:br/>
       </w:r>
@@ -1259,6 +1354,7 @@
       <w:r>
         <w:rPr>
           <w:rFonts w:ascii="Courier New" w:hAnsi="Courier New"/>
+          <w:sz w:val="18"/>
         </w:rPr>
         <w:br/>
       </w:r>
@@ -1272,6 +1368,7 @@
       <w:r>
         <w:rPr>
           <w:rFonts w:ascii="Courier New" w:hAnsi="Courier New"/>
+          <w:sz w:val="18"/>
         </w:rPr>
         <w:br/>
       </w:r>
@@ -1285,6 +1382,7 @@
       <w:r>
         <w:rPr>
           <w:rFonts w:ascii="Courier New" w:hAnsi="Courier New"/>
+          <w:sz w:val="18"/>
         </w:rPr>
         <w:br/>
       </w:r>
@@ -1298,6 +1396,7 @@
       <w:r>
         <w:rPr>
           <w:rFonts w:ascii="Courier New" w:hAnsi="Courier New"/>
+          <w:sz w:val="18"/>
         </w:rPr>
         <w:br/>
       </w:r>
@@ -1311,6 +1410,7 @@
       <w:r>
         <w:rPr>
           <w:rFonts w:ascii="Courier New" w:hAnsi="Courier New"/>
+          <w:sz w:val="18"/>
         </w:rPr>
         <w:br/>
       </w:r>
@@ -1324,6 +1424,7 @@
       <w:r>
         <w:rPr>
           <w:rFonts w:ascii="Courier New" w:hAnsi="Courier New"/>
+          <w:sz w:val="18"/>
         </w:rPr>
         <w:br/>
       </w:r>
@@ -1337,6 +1438,7 @@
       <w:r>
         <w:rPr>
           <w:rFonts w:ascii="Courier New" w:hAnsi="Courier New"/>
+          <w:sz w:val="18"/>
         </w:rPr>
         <w:br/>
       </w:r>
@@ -1350,6 +1452,7 @@
       <w:r>
         <w:rPr>
           <w:rFonts w:ascii="Courier New" w:hAnsi="Courier New"/>
+          <w:sz w:val="18"/>
         </w:rPr>
         <w:br/>
       </w:r>
@@ -1363,6 +1466,7 @@
       <w:r>
         <w:rPr>
           <w:rFonts w:ascii="Courier New" w:hAnsi="Courier New"/>
+          <w:sz w:val="18"/>
         </w:rPr>
         <w:br/>
       </w:r>
@@ -1376,6 +1480,7 @@
       <w:r>
         <w:rPr>
           <w:rFonts w:ascii="Courier New" w:hAnsi="Courier New"/>
+          <w:sz w:val="18"/>
         </w:rPr>
         <w:br/>
       </w:r>
@@ -1389,6 +1494,7 @@
       <w:r>
         <w:rPr>
           <w:rFonts w:ascii="Courier New" w:hAnsi="Courier New"/>
+          <w:sz w:val="18"/>
         </w:rPr>
         <w:br/>
       </w:r>
@@ -1402,12 +1508,14 @@
     </w:p>
     <w:p>
       <w:pPr>
-        <w:spacing w:before="200" w:after="100"/>
+        <w:keepNext/>
+        <w:spacing w:before="240" w:after="120"/>
+        <w:jc w:val="left"/>
       </w:pPr>
       <w:r>
         <w:rPr>
           <w:b/>
-          <w:sz w:val="28"/>
+          <w:sz w:val="30"/>
         </w:rPr>
         <w:t xml:space="preserve">8. PIO VA DMA O'RTASIDAGI QIYOSIY TAHLIL (JADVAL)</w:t>
       </w:r>
@@ -1428,8 +1536,18 @@
         <w:tc>
           <w:tcPr>
             <w:shd w:val="clear" w:fill="D9E2F3"/>
-          </w:tcPr>
-          <w:p>
+            <w:tcMar>
+              <w:top w:w="40" w:type="dxa"/>
+              <w:bottom w:w="40" w:type="dxa"/>
+              <w:left w:w="80" w:type="dxa"/>
+              <w:right w:w="80" w:type="dxa"/>
+            </w:tcMar>
+          </w:tcPr>
+          <w:p>
+            <w:pPr>
+              <w:spacing w:after="0" w:line="240" w:lineRule="auto"/>
+              <w:jc w:val="left"/>
+            </w:pPr>
             <w:r>
               <w:rPr>
                 <w:b/>
@@ -1441,8 +1559,18 @@
         <w:tc>
           <w:tcPr>
             <w:shd w:val="clear" w:fill="D9E2F3"/>
-          </w:tcPr>
-          <w:p>
+            <w:tcMar>
+              <w:top w:w="40" w:type="dxa"/>
+              <w:bottom w:w="40" w:type="dxa"/>
+              <w:left w:w="80" w:type="dxa"/>
+              <w:right w:w="80" w:type="dxa"/>
+            </w:tcMar>
+          </w:tcPr>
+          <w:p>
+            <w:pPr>
+              <w:spacing w:after="0" w:line="240" w:lineRule="auto"/>
+              <w:jc w:val="left"/>
+            </w:pPr>
             <w:r>
               <w:rPr>
                 <w:b/>
@@ -1454,8 +1582,18 @@
         <w:tc>
           <w:tcPr>
             <w:shd w:val="clear" w:fill="D9E2F3"/>
-          </w:tcPr>
-          <w:p>
+            <w:tcMar>
+              <w:top w:w="40" w:type="dxa"/>
+              <w:bottom w:w="40" w:type="dxa"/>
+              <w:left w:w="80" w:type="dxa"/>
+              <w:right w:w="80" w:type="dxa"/>
+            </w:tcMar>
+          </w:tcPr>
+          <w:p>
+            <w:pPr>
+              <w:spacing w:after="0" w:line="240" w:lineRule="auto"/>
+              <w:jc w:val="left"/>
+            </w:pPr>
             <w:r>
               <w:rPr>
                 <w:b/>
@@ -1467,8 +1605,18 @@
         <w:tc>
           <w:tcPr>
             <w:shd w:val="clear" w:fill="D9E2F3"/>
-          </w:tcPr>
-          <w:p>
+            <w:tcMar>
+              <w:top w:w="40" w:type="dxa"/>
+              <w:bottom w:w="40" w:type="dxa"/>
+              <w:left w:w="80" w:type="dxa"/>
+              <w:right w:w="80" w:type="dxa"/>
+            </w:tcMar>
+          </w:tcPr>
+          <w:p>
+            <w:pPr>
+              <w:spacing w:after="0" w:line="240" w:lineRule="auto"/>
+              <w:jc w:val="left"/>
+            </w:pPr>
             <w:r>
               <w:rPr>
                 <w:b/>
@@ -1482,8 +1630,18 @@
         <w:tc>
           <w:tcPr>
             <w:shd w:val="clear" w:fill="FFFFFF"/>
-          </w:tcPr>
-          <w:p>
+            <w:tcMar>
+              <w:top w:w="40" w:type="dxa"/>
+              <w:bottom w:w="40" w:type="dxa"/>
+              <w:left w:w="80" w:type="dxa"/>
+              <w:right w:w="80" w:type="dxa"/>
+            </w:tcMar>
+          </w:tcPr>
+          <w:p>
+            <w:pPr>
+              <w:spacing w:after="0" w:line="240" w:lineRule="auto"/>
+              <w:jc w:val="left"/>
+            </w:pPr>
             <w:r>
               <w:rPr/>
               <w:t xml:space="preserve">1</w:t>
@@ -1493,8 +1651,18 @@
         <w:tc>
           <w:tcPr>
             <w:shd w:val="clear" w:fill="FFFFFF"/>
-          </w:tcPr>
-          <w:p>
+            <w:tcMar>
+              <w:top w:w="40" w:type="dxa"/>
+              <w:bottom w:w="40" w:type="dxa"/>
+              <w:left w:w="80" w:type="dxa"/>
+              <w:right w:w="80" w:type="dxa"/>
+            </w:tcMar>
+          </w:tcPr>
+          <w:p>
+            <w:pPr>
+              <w:spacing w:after="0" w:line="240" w:lineRule="auto"/>
+              <w:jc w:val="left"/>
+            </w:pPr>
             <w:r>
               <w:rPr/>
               <w:t xml:space="preserve">Boshqaruvchi</w:t>
@@ -1504,8 +1672,18 @@
         <w:tc>
           <w:tcPr>
             <w:shd w:val="clear" w:fill="FFFFFF"/>
-          </w:tcPr>
-          <w:p>
+            <w:tcMar>
+              <w:top w:w="40" w:type="dxa"/>
+              <w:bottom w:w="40" w:type="dxa"/>
+              <w:left w:w="80" w:type="dxa"/>
+              <w:right w:w="80" w:type="dxa"/>
+            </w:tcMar>
+          </w:tcPr>
+          <w:p>
+            <w:pPr>
+              <w:spacing w:after="0" w:line="240" w:lineRule="auto"/>
+              <w:jc w:val="left"/>
+            </w:pPr>
             <w:r>
               <w:rPr/>
               <w:t xml:space="preserve">Protsessor (CPU)</w:t>
@@ -1515,8 +1693,18 @@
         <w:tc>
           <w:tcPr>
             <w:shd w:val="clear" w:fill="FFFFFF"/>
-          </w:tcPr>
-          <w:p>
+            <w:tcMar>
+              <w:top w:w="40" w:type="dxa"/>
+              <w:bottom w:w="40" w:type="dxa"/>
+              <w:left w:w="80" w:type="dxa"/>
+              <w:right w:w="80" w:type="dxa"/>
+            </w:tcMar>
+          </w:tcPr>
+          <w:p>
+            <w:pPr>
+              <w:spacing w:after="0" w:line="240" w:lineRule="auto"/>
+              <w:jc w:val="left"/>
+            </w:pPr>
             <w:r>
               <w:rPr/>
               <w:t xml:space="preserve">DMA kontroller</w:t>
@@ -1528,8 +1716,18 @@
         <w:tc>
           <w:tcPr>
             <w:shd w:val="clear" w:fill="FFFFFF"/>
-          </w:tcPr>
-          <w:p>
+            <w:tcMar>
+              <w:top w:w="40" w:type="dxa"/>
+              <w:bottom w:w="40" w:type="dxa"/>
+              <w:left w:w="80" w:type="dxa"/>
+              <w:right w:w="80" w:type="dxa"/>
+            </w:tcMar>
+          </w:tcPr>
+          <w:p>
+            <w:pPr>
+              <w:spacing w:after="0" w:line="240" w:lineRule="auto"/>
+              <w:jc w:val="left"/>
+            </w:pPr>
             <w:r>
               <w:rPr/>
               <w:t xml:space="preserve">2</w:t>
@@ -1539,8 +1737,18 @@
         <w:tc>
           <w:tcPr>
             <w:shd w:val="clear" w:fill="FFFFFF"/>
-          </w:tcPr>
-          <w:p>
+            <w:tcMar>
+              <w:top w:w="40" w:type="dxa"/>
+              <w:bottom w:w="40" w:type="dxa"/>
+              <w:left w:w="80" w:type="dxa"/>
+              <w:right w:w="80" w:type="dxa"/>
+            </w:tcMar>
+          </w:tcPr>
+          <w:p>
+            <w:pPr>
+              <w:spacing w:after="0" w:line="240" w:lineRule="auto"/>
+              <w:jc w:val="left"/>
+            </w:pPr>
             <w:r>
               <w:rPr/>
               <w:t xml:space="preserve">CPU bandligi</w:t>
@@ -1550,8 +1758,18 @@
         <w:tc>
           <w:tcPr>
             <w:shd w:val="clear" w:fill="FFFFFF"/>
-          </w:tcPr>
-          <w:p>
+            <w:tcMar>
+              <w:top w:w="40" w:type="dxa"/>
+              <w:bottom w:w="40" w:type="dxa"/>
+              <w:left w:w="80" w:type="dxa"/>
+              <w:right w:w="80" w:type="dxa"/>
+            </w:tcMar>
+          </w:tcPr>
+          <w:p>
+            <w:pPr>
+              <w:spacing w:after="0" w:line="240" w:lineRule="auto"/>
+              <w:jc w:val="left"/>
+            </w:pPr>
             <w:r>
               <w:rPr/>
               <w:t xml:space="preserve">To'liq band (100%)</w:t>
@@ -1561,8 +1779,18 @@
         <w:tc>
           <w:tcPr>
             <w:shd w:val="clear" w:fill="FFFFFF"/>
-          </w:tcPr>
-          <w:p>
+            <w:tcMar>
+              <w:top w:w="40" w:type="dxa"/>
+              <w:bottom w:w="40" w:type="dxa"/>
+              <w:left w:w="80" w:type="dxa"/>
+              <w:right w:w="80" w:type="dxa"/>
+            </w:tcMar>
+          </w:tcPr>
+          <w:p>
+            <w:pPr>
+              <w:spacing w:after="0" w:line="240" w:lineRule="auto"/>
+              <w:jc w:val="left"/>
+            </w:pPr>
             <w:r>
               <w:rPr/>
               <w:t xml:space="preserve">Deyarli bo'sh (faqat start/stop)</w:t>
@@ -1574,8 +1802,18 @@
         <w:tc>
           <w:tcPr>
             <w:shd w:val="clear" w:fill="FFFFFF"/>
-          </w:tcPr>
-          <w:p>
+            <w:tcMar>
+              <w:top w:w="40" w:type="dxa"/>
+              <w:bottom w:w="40" w:type="dxa"/>
+              <w:left w:w="80" w:type="dxa"/>
+              <w:right w:w="80" w:type="dxa"/>
+            </w:tcMar>
+          </w:tcPr>
+          <w:p>
+            <w:pPr>
+              <w:spacing w:after="0" w:line="240" w:lineRule="auto"/>
+              <w:jc w:val="left"/>
+            </w:pPr>
             <w:r>
               <w:rPr/>
               <w:t xml:space="preserve">3</w:t>
@@ -1585,8 +1823,18 @@
         <w:tc>
           <w:tcPr>
             <w:shd w:val="clear" w:fill="FFFFFF"/>
-          </w:tcPr>
-          <w:p>
+            <w:tcMar>
+              <w:top w:w="40" w:type="dxa"/>
+              <w:bottom w:w="40" w:type="dxa"/>
+              <w:left w:w="80" w:type="dxa"/>
+              <w:right w:w="80" w:type="dxa"/>
+            </w:tcMar>
+          </w:tcPr>
+          <w:p>
+            <w:pPr>
+              <w:spacing w:after="0" w:line="240" w:lineRule="auto"/>
+              <w:jc w:val="left"/>
+            </w:pPr>
             <w:r>
               <w:rPr/>
               <w:t xml:space="preserve">Ma'lumot yo'li</w:t>
@@ -1596,8 +1844,18 @@
         <w:tc>
           <w:tcPr>
             <w:shd w:val="clear" w:fill="FFFFFF"/>
-          </w:tcPr>
-          <w:p>
+            <w:tcMar>
+              <w:top w:w="40" w:type="dxa"/>
+              <w:bottom w:w="40" w:type="dxa"/>
+              <w:left w:w="80" w:type="dxa"/>
+              <w:right w:w="80" w:type="dxa"/>
+            </w:tcMar>
+          </w:tcPr>
+          <w:p>
+            <w:pPr>
+              <w:spacing w:after="0" w:line="240" w:lineRule="auto"/>
+              <w:jc w:val="left"/>
+            </w:pPr>
             <w:r>
               <w:rPr/>
               <w:t xml:space="preserve">Qurilma → CPU → Xotira</w:t>
@@ -1607,8 +1865,18 @@
         <w:tc>
           <w:tcPr>
             <w:shd w:val="clear" w:fill="FFFFFF"/>
-          </w:tcPr>
-          <w:p>
+            <w:tcMar>
+              <w:top w:w="40" w:type="dxa"/>
+              <w:bottom w:w="40" w:type="dxa"/>
+              <w:left w:w="80" w:type="dxa"/>
+              <w:right w:w="80" w:type="dxa"/>
+            </w:tcMar>
+          </w:tcPr>
+          <w:p>
+            <w:pPr>
+              <w:spacing w:after="0" w:line="240" w:lineRule="auto"/>
+              <w:jc w:val="left"/>
+            </w:pPr>
             <w:r>
               <w:rPr/>
               <w:t xml:space="preserve">Qurilma → Xotira (to'g'ridan-to'g'ri)</w:t>
@@ -1620,8 +1888,18 @@
         <w:tc>
           <w:tcPr>
             <w:shd w:val="clear" w:fill="FFFFFF"/>
-          </w:tcPr>
-          <w:p>
+            <w:tcMar>
+              <w:top w:w="40" w:type="dxa"/>
+              <w:bottom w:w="40" w:type="dxa"/>
+              <w:left w:w="80" w:type="dxa"/>
+              <w:right w:w="80" w:type="dxa"/>
+            </w:tcMar>
+          </w:tcPr>
+          <w:p>
+            <w:pPr>
+              <w:spacing w:after="0" w:line="240" w:lineRule="auto"/>
+              <w:jc w:val="left"/>
+            </w:pPr>
             <w:r>
               <w:rPr/>
               <w:t xml:space="preserve">4</w:t>
@@ -1631,8 +1909,18 @@
         <w:tc>
           <w:tcPr>
             <w:shd w:val="clear" w:fill="FFFFFF"/>
-          </w:tcPr>
-          <w:p>
+            <w:tcMar>
+              <w:top w:w="40" w:type="dxa"/>
+              <w:bottom w:w="40" w:type="dxa"/>
+              <w:left w:w="80" w:type="dxa"/>
+              <w:right w:w="80" w:type="dxa"/>
+            </w:tcMar>
+          </w:tcPr>
+          <w:p>
+            <w:pPr>
+              <w:spacing w:after="0" w:line="240" w:lineRule="auto"/>
+              <w:jc w:val="left"/>
+            </w:pPr>
             <w:r>
               <w:rPr/>
               <w:t xml:space="preserve">Tezlik</w:t>
@@ -1642,8 +1930,18 @@
         <w:tc>
           <w:tcPr>
             <w:shd w:val="clear" w:fill="FFFFFF"/>
-          </w:tcPr>
-          <w:p>
+            <w:tcMar>
+              <w:top w:w="40" w:type="dxa"/>
+              <w:bottom w:w="40" w:type="dxa"/>
+              <w:left w:w="80" w:type="dxa"/>
+              <w:right w:w="80" w:type="dxa"/>
+            </w:tcMar>
+          </w:tcPr>
+          <w:p>
+            <w:pPr>
+              <w:spacing w:after="0" w:line="240" w:lineRule="auto"/>
+              <w:jc w:val="left"/>
+            </w:pPr>
             <w:r>
               <w:rPr/>
               <w:t xml:space="preserve">Sekin</w:t>
@@ -1653,8 +1951,18 @@
         <w:tc>
           <w:tcPr>
             <w:shd w:val="clear" w:fill="FFFFFF"/>
-          </w:tcPr>
-          <w:p>
+            <w:tcMar>
+              <w:top w:w="40" w:type="dxa"/>
+              <w:bottom w:w="40" w:type="dxa"/>
+              <w:left w:w="80" w:type="dxa"/>
+              <w:right w:w="80" w:type="dxa"/>
+            </w:tcMar>
+          </w:tcPr>
+          <w:p>
+            <w:pPr>
+              <w:spacing w:after="0" w:line="240" w:lineRule="auto"/>
+              <w:jc w:val="left"/>
+            </w:pPr>
             <w:r>
               <w:rPr/>
               <w:t xml:space="preserve">Tez</w:t>
@@ -1666,8 +1974,18 @@
         <w:tc>
           <w:tcPr>
             <w:shd w:val="clear" w:fill="FFFFFF"/>
-          </w:tcPr>
-          <w:p>
+            <w:tcMar>
+              <w:top w:w="40" w:type="dxa"/>
+              <w:bottom w:w="40" w:type="dxa"/>
+              <w:left w:w="80" w:type="dxa"/>
+              <w:right w:w="80" w:type="dxa"/>
+            </w:tcMar>
+          </w:tcPr>
+          <w:p>
+            <w:pPr>
+              <w:spacing w:after="0" w:line="240" w:lineRule="auto"/>
+              <w:jc w:val="left"/>
+            </w:pPr>
             <w:r>
               <w:rPr/>
               <w:t xml:space="preserve">5</w:t>
@@ -1677,8 +1995,18 @@
         <w:tc>
           <w:tcPr>
             <w:shd w:val="clear" w:fill="FFFFFF"/>
-          </w:tcPr>
-          <w:p>
+            <w:tcMar>
+              <w:top w:w="40" w:type="dxa"/>
+              <w:bottom w:w="40" w:type="dxa"/>
+              <w:left w:w="80" w:type="dxa"/>
+              <w:right w:w="80" w:type="dxa"/>
+            </w:tcMar>
+          </w:tcPr>
+          <w:p>
+            <w:pPr>
+              <w:spacing w:after="0" w:line="240" w:lineRule="auto"/>
+              <w:jc w:val="left"/>
+            </w:pPr>
             <w:r>
               <w:rPr/>
               <w:t xml:space="preserve">Uzilishlar soni</w:t>
@@ -1688,8 +2016,18 @@
         <w:tc>
           <w:tcPr>
             <w:shd w:val="clear" w:fill="FFFFFF"/>
-          </w:tcPr>
-          <w:p>
+            <w:tcMar>
+              <w:top w:w="40" w:type="dxa"/>
+              <w:bottom w:w="40" w:type="dxa"/>
+              <w:left w:w="80" w:type="dxa"/>
+              <w:right w:w="80" w:type="dxa"/>
+            </w:tcMar>
+          </w:tcPr>
+          <w:p>
+            <w:pPr>
+              <w:spacing w:after="0" w:line="240" w:lineRule="auto"/>
+              <w:jc w:val="left"/>
+            </w:pPr>
             <w:r>
               <w:rPr/>
               <w:t xml:space="preserve">Ko'p (har bayt/blok)</w:t>
@@ -1699,8 +2037,18 @@
         <w:tc>
           <w:tcPr>
             <w:shd w:val="clear" w:fill="FFFFFF"/>
-          </w:tcPr>
-          <w:p>
+            <w:tcMar>
+              <w:top w:w="40" w:type="dxa"/>
+              <w:bottom w:w="40" w:type="dxa"/>
+              <w:left w:w="80" w:type="dxa"/>
+              <w:right w:w="80" w:type="dxa"/>
+            </w:tcMar>
+          </w:tcPr>
+          <w:p>
+            <w:pPr>
+              <w:spacing w:after="0" w:line="240" w:lineRule="auto"/>
+              <w:jc w:val="left"/>
+            </w:pPr>
             <w:r>
               <w:rPr/>
               <w:t xml:space="preserve">Kam (bitta, blok tugaganda)</w:t>
@@ -1712,8 +2060,18 @@
         <w:tc>
           <w:tcPr>
             <w:shd w:val="clear" w:fill="FFFFFF"/>
-          </w:tcPr>
-          <w:p>
+            <w:tcMar>
+              <w:top w:w="40" w:type="dxa"/>
+              <w:bottom w:w="40" w:type="dxa"/>
+              <w:left w:w="80" w:type="dxa"/>
+              <w:right w:w="80" w:type="dxa"/>
+            </w:tcMar>
+          </w:tcPr>
+          <w:p>
+            <w:pPr>
+              <w:spacing w:after="0" w:line="240" w:lineRule="auto"/>
+              <w:jc w:val="left"/>
+            </w:pPr>
             <w:r>
               <w:rPr/>
               <w:t xml:space="preserve">6</w:t>
@@ -1723,8 +2081,18 @@
         <w:tc>
           <w:tcPr>
             <w:shd w:val="clear" w:fill="FFFFFF"/>
-          </w:tcPr>
-          <w:p>
+            <w:tcMar>
+              <w:top w:w="40" w:type="dxa"/>
+              <w:bottom w:w="40" w:type="dxa"/>
+              <w:left w:w="80" w:type="dxa"/>
+              <w:right w:w="80" w:type="dxa"/>
+            </w:tcMar>
+          </w:tcPr>
+          <w:p>
+            <w:pPr>
+              <w:spacing w:after="0" w:line="240" w:lineRule="auto"/>
+              <w:jc w:val="left"/>
+            </w:pPr>
             <w:r>
               <w:rPr/>
               <w:t xml:space="preserve">Apparat narxi</w:t>
@@ -1734,8 +2102,18 @@
         <w:tc>
           <w:tcPr>
             <w:shd w:val="clear" w:fill="FFFFFF"/>
-          </w:tcPr>
-          <w:p>
+            <w:tcMar>
+              <w:top w:w="40" w:type="dxa"/>
+              <w:bottom w:w="40" w:type="dxa"/>
+              <w:left w:w="80" w:type="dxa"/>
+              <w:right w:w="80" w:type="dxa"/>
+            </w:tcMar>
+          </w:tcPr>
+          <w:p>
+            <w:pPr>
+              <w:spacing w:after="0" w:line="240" w:lineRule="auto"/>
+              <w:jc w:val="left"/>
+            </w:pPr>
             <w:r>
               <w:rPr/>
               <w:t xml:space="preserve">Arzon (qo'shimcha apparat yo'q)</w:t>
@@ -1745,8 +2123,18 @@
         <w:tc>
           <w:tcPr>
             <w:shd w:val="clear" w:fill="FFFFFF"/>
-          </w:tcPr>
-          <w:p>
+            <w:tcMar>
+              <w:top w:w="40" w:type="dxa"/>
+              <w:bottom w:w="40" w:type="dxa"/>
+              <w:left w:w="80" w:type="dxa"/>
+              <w:right w:w="80" w:type="dxa"/>
+            </w:tcMar>
+          </w:tcPr>
+          <w:p>
+            <w:pPr>
+              <w:spacing w:after="0" w:line="240" w:lineRule="auto"/>
+              <w:jc w:val="left"/>
+            </w:pPr>
             <w:r>
               <w:rPr/>
               <w:t xml:space="preserve">Qimmat (DMA kontroller kerak)</w:t>
@@ -1758,8 +2146,18 @@
         <w:tc>
           <w:tcPr>
             <w:shd w:val="clear" w:fill="FFFFFF"/>
-          </w:tcPr>
-          <w:p>
+            <w:tcMar>
+              <w:top w:w="40" w:type="dxa"/>
+              <w:bottom w:w="40" w:type="dxa"/>
+              <w:left w:w="80" w:type="dxa"/>
+              <w:right w:w="80" w:type="dxa"/>
+            </w:tcMar>
+          </w:tcPr>
+          <w:p>
+            <w:pPr>
+              <w:spacing w:after="0" w:line="240" w:lineRule="auto"/>
+              <w:jc w:val="left"/>
+            </w:pPr>
             <w:r>
               <w:rPr/>
               <w:t xml:space="preserve">7</w:t>
@@ -1769,8 +2167,18 @@
         <w:tc>
           <w:tcPr>
             <w:shd w:val="clear" w:fill="FFFFFF"/>
-          </w:tcPr>
-          <w:p>
+            <w:tcMar>
+              <w:top w:w="40" w:type="dxa"/>
+              <w:bottom w:w="40" w:type="dxa"/>
+              <w:left w:w="80" w:type="dxa"/>
+              <w:right w:w="80" w:type="dxa"/>
+            </w:tcMar>
+          </w:tcPr>
+          <w:p>
+            <w:pPr>
+              <w:spacing w:after="0" w:line="240" w:lineRule="auto"/>
+              <w:jc w:val="left"/>
+            </w:pPr>
             <w:r>
               <w:rPr/>
               <w:t xml:space="preserve">Murakkablik</w:t>
@@ -1780,8 +2188,18 @@
         <w:tc>
           <w:tcPr>
             <w:shd w:val="clear" w:fill="FFFFFF"/>
-          </w:tcPr>
-          <w:p>
+            <w:tcMar>
+              <w:top w:w="40" w:type="dxa"/>
+              <w:bottom w:w="40" w:type="dxa"/>
+              <w:left w:w="80" w:type="dxa"/>
+              <w:right w:w="80" w:type="dxa"/>
+            </w:tcMar>
+          </w:tcPr>
+          <w:p>
+            <w:pPr>
+              <w:spacing w:after="0" w:line="240" w:lineRule="auto"/>
+              <w:jc w:val="left"/>
+            </w:pPr>
             <w:r>
               <w:rPr/>
               <w:t xml:space="preserve">Sodda</w:t>
@@ -1791,8 +2209,18 @@
         <w:tc>
           <w:tcPr>
             <w:shd w:val="clear" w:fill="FFFFFF"/>
-          </w:tcPr>
-          <w:p>
+            <w:tcMar>
+              <w:top w:w="40" w:type="dxa"/>
+              <w:bottom w:w="40" w:type="dxa"/>
+              <w:left w:w="80" w:type="dxa"/>
+              <w:right w:w="80" w:type="dxa"/>
+            </w:tcMar>
+          </w:tcPr>
+          <w:p>
+            <w:pPr>
+              <w:spacing w:after="0" w:line="240" w:lineRule="auto"/>
+              <w:jc w:val="left"/>
+            </w:pPr>
             <w:r>
               <w:rPr/>
               <w:t xml:space="preserve">Murakkabroq</w:t>
@@ -1804,8 +2232,18 @@
         <w:tc>
           <w:tcPr>
             <w:shd w:val="clear" w:fill="FFFFFF"/>
-          </w:tcPr>
-          <w:p>
+            <w:tcMar>
+              <w:top w:w="40" w:type="dxa"/>
+              <w:bottom w:w="40" w:type="dxa"/>
+              <w:left w:w="80" w:type="dxa"/>
+              <w:right w:w="80" w:type="dxa"/>
+            </w:tcMar>
+          </w:tcPr>
+          <w:p>
+            <w:pPr>
+              <w:spacing w:after="0" w:line="240" w:lineRule="auto"/>
+              <w:jc w:val="left"/>
+            </w:pPr>
             <w:r>
               <w:rPr/>
               <w:t xml:space="preserve">8</w:t>
@@ -1815,8 +2253,18 @@
         <w:tc>
           <w:tcPr>
             <w:shd w:val="clear" w:fill="FFFFFF"/>
-          </w:tcPr>
-          <w:p>
+            <w:tcMar>
+              <w:top w:w="40" w:type="dxa"/>
+              <w:bottom w:w="40" w:type="dxa"/>
+              <w:left w:w="80" w:type="dxa"/>
+              <w:right w:w="80" w:type="dxa"/>
+            </w:tcMar>
+          </w:tcPr>
+          <w:p>
+            <w:pPr>
+              <w:spacing w:after="0" w:line="240" w:lineRule="auto"/>
+              <w:jc w:val="left"/>
+            </w:pPr>
             <w:r>
               <w:rPr/>
               <w:t xml:space="preserve">Mos hajm</w:t>
@@ -1826,8 +2274,18 @@
         <w:tc>
           <w:tcPr>
             <w:shd w:val="clear" w:fill="FFFFFF"/>
-          </w:tcPr>
-          <w:p>
+            <w:tcMar>
+              <w:top w:w="40" w:type="dxa"/>
+              <w:bottom w:w="40" w:type="dxa"/>
+              <w:left w:w="80" w:type="dxa"/>
+              <w:right w:w="80" w:type="dxa"/>
+            </w:tcMar>
+          </w:tcPr>
+          <w:p>
+            <w:pPr>
+              <w:spacing w:after="0" w:line="240" w:lineRule="auto"/>
+              <w:jc w:val="left"/>
+            </w:pPr>
             <w:r>
               <w:rPr/>
               <w:t xml:space="preserve">Kichik ma'lumotlar</w:t>
@@ -1837,8 +2295,18 @@
         <w:tc>
           <w:tcPr>
             <w:shd w:val="clear" w:fill="FFFFFF"/>
-          </w:tcPr>
-          <w:p>
+            <w:tcMar>
+              <w:top w:w="40" w:type="dxa"/>
+              <w:bottom w:w="40" w:type="dxa"/>
+              <w:left w:w="80" w:type="dxa"/>
+              <w:right w:w="80" w:type="dxa"/>
+            </w:tcMar>
+          </w:tcPr>
+          <w:p>
+            <w:pPr>
+              <w:spacing w:after="0" w:line="240" w:lineRule="auto"/>
+              <w:jc w:val="left"/>
+            </w:pPr>
             <w:r>
               <w:rPr/>
               <w:t xml:space="preserve">Katta ma'lumot bloklari</w:t>
@@ -1850,8 +2318,18 @@
         <w:tc>
           <w:tcPr>
             <w:shd w:val="clear" w:fill="FFFFFF"/>
-          </w:tcPr>
-          <w:p>
+            <w:tcMar>
+              <w:top w:w="40" w:type="dxa"/>
+              <w:bottom w:w="40" w:type="dxa"/>
+              <w:left w:w="80" w:type="dxa"/>
+              <w:right w:w="80" w:type="dxa"/>
+            </w:tcMar>
+          </w:tcPr>
+          <w:p>
+            <w:pPr>
+              <w:spacing w:after="0" w:line="240" w:lineRule="auto"/>
+              <w:jc w:val="left"/>
+            </w:pPr>
             <w:r>
               <w:rPr/>
               <w:t xml:space="preserve">9</w:t>
@@ -1861,8 +2339,18 @@
         <w:tc>
           <w:tcPr>
             <w:shd w:val="clear" w:fill="FFFFFF"/>
-          </w:tcPr>
-          <w:p>
+            <w:tcMar>
+              <w:top w:w="40" w:type="dxa"/>
+              <w:bottom w:w="40" w:type="dxa"/>
+              <w:left w:w="80" w:type="dxa"/>
+              <w:right w:w="80" w:type="dxa"/>
+            </w:tcMar>
+          </w:tcPr>
+          <w:p>
+            <w:pPr>
+              <w:spacing w:after="0" w:line="240" w:lineRule="auto"/>
+              <w:jc w:val="left"/>
+            </w:pPr>
             <w:r>
               <w:rPr/>
               <w:t xml:space="preserve">Samaradorlik</w:t>
@@ -1872,8 +2360,18 @@
         <w:tc>
           <w:tcPr>
             <w:shd w:val="clear" w:fill="FFFFFF"/>
-          </w:tcPr>
-          <w:p>
+            <w:tcMar>
+              <w:top w:w="40" w:type="dxa"/>
+              <w:bottom w:w="40" w:type="dxa"/>
+              <w:left w:w="80" w:type="dxa"/>
+              <w:right w:w="80" w:type="dxa"/>
+            </w:tcMar>
+          </w:tcPr>
+          <w:p>
+            <w:pPr>
+              <w:spacing w:after="0" w:line="240" w:lineRule="auto"/>
+              <w:jc w:val="left"/>
+            </w:pPr>
             <w:r>
               <w:rPr/>
               <w:t xml:space="preserve">Past (katta hajmda)</w:t>
@@ -1883,8 +2381,18 @@
         <w:tc>
           <w:tcPr>
             <w:shd w:val="clear" w:fill="FFFFFF"/>
-          </w:tcPr>
-          <w:p>
+            <w:tcMar>
+              <w:top w:w="40" w:type="dxa"/>
+              <w:bottom w:w="40" w:type="dxa"/>
+              <w:left w:w="80" w:type="dxa"/>
+              <w:right w:w="80" w:type="dxa"/>
+            </w:tcMar>
+          </w:tcPr>
+          <w:p>
+            <w:pPr>
+              <w:spacing w:after="0" w:line="240" w:lineRule="auto"/>
+              <w:jc w:val="left"/>
+            </w:pPr>
             <w:r>
               <w:rPr/>
               <w:t xml:space="preserve">Yuqori</w:t>
@@ -1896,8 +2404,18 @@
         <w:tc>
           <w:tcPr>
             <w:shd w:val="clear" w:fill="FFFFFF"/>
-          </w:tcPr>
-          <w:p>
+            <w:tcMar>
+              <w:top w:w="40" w:type="dxa"/>
+              <w:bottom w:w="40" w:type="dxa"/>
+              <w:left w:w="80" w:type="dxa"/>
+              <w:right w:w="80" w:type="dxa"/>
+            </w:tcMar>
+          </w:tcPr>
+          <w:p>
+            <w:pPr>
+              <w:spacing w:after="0" w:line="240" w:lineRule="auto"/>
+              <w:jc w:val="left"/>
+            </w:pPr>
             <w:r>
               <w:rPr/>
               <w:t xml:space="preserve">10</w:t>
@@ -1907,8 +2425,18 @@
         <w:tc>
           <w:tcPr>
             <w:shd w:val="clear" w:fill="FFFFFF"/>
-          </w:tcPr>
-          <w:p>
+            <w:tcMar>
+              <w:top w:w="40" w:type="dxa"/>
+              <w:bottom w:w="40" w:type="dxa"/>
+              <w:left w:w="80" w:type="dxa"/>
+              <w:right w:w="80" w:type="dxa"/>
+            </w:tcMar>
+          </w:tcPr>
+          <w:p>
+            <w:pPr>
+              <w:spacing w:after="0" w:line="240" w:lineRule="auto"/>
+              <w:jc w:val="left"/>
+            </w:pPr>
             <w:r>
               <w:rPr/>
               <w:t xml:space="preserve">Misol qurilmalar</w:t>
@@ -1918,8 +2446,18 @@
         <w:tc>
           <w:tcPr>
             <w:shd w:val="clear" w:fill="FFFFFF"/>
-          </w:tcPr>
-          <w:p>
+            <w:tcMar>
+              <w:top w:w="40" w:type="dxa"/>
+              <w:bottom w:w="40" w:type="dxa"/>
+              <w:left w:w="80" w:type="dxa"/>
+              <w:right w:w="80" w:type="dxa"/>
+            </w:tcMar>
+          </w:tcPr>
+          <w:p>
+            <w:pPr>
+              <w:spacing w:after="0" w:line="240" w:lineRule="auto"/>
+              <w:jc w:val="left"/>
+            </w:pPr>
             <w:r>
               <w:rPr/>
               <w:t xml:space="preserve">Klaviatura, sichqoncha</w:t>
@@ -1929,8 +2467,18 @@
         <w:tc>
           <w:tcPr>
             <w:shd w:val="clear" w:fill="FFFFFF"/>
-          </w:tcPr>
-          <w:p>
+            <w:tcMar>
+              <w:top w:w="40" w:type="dxa"/>
+              <w:bottom w:w="40" w:type="dxa"/>
+              <w:left w:w="80" w:type="dxa"/>
+              <w:right w:w="80" w:type="dxa"/>
+            </w:tcMar>
+          </w:tcPr>
+          <w:p>
+            <w:pPr>
+              <w:spacing w:after="0" w:line="240" w:lineRule="auto"/>
+              <w:jc w:val="left"/>
+            </w:pPr>
             <w:r>
               <w:rPr/>
               <w:t xml:space="preserve">Disk, tarmoq, video, audio</w:t>
@@ -1942,12 +2490,14 @@
     <w:p/>
     <w:p>
       <w:pPr>
-        <w:spacing w:before="200" w:after="100"/>
+        <w:keepNext/>
+        <w:spacing w:before="240" w:after="120"/>
+        <w:jc w:val="left"/>
       </w:pPr>
       <w:r>
         <w:rPr>
           <w:b/>
-          <w:sz w:val="28"/>
+          <w:sz w:val="30"/>
         </w:rPr>
         <w:t xml:space="preserve">9. VAQT DIAGRAMMASI ORQALI MODELLASHTIRISH</w:t>
       </w:r>
@@ -1961,8 +2511,15 @@
     </w:p>
     <w:p>
       <w:pPr>
-        <w:spacing w:after="120"/>
+        <w:spacing w:after="160" w:line="240" w:lineRule="auto"/>
+        <w:pBdr>
+          <w:top w:val="single" w:sz="4" w:space="4" w:color="B0B0B0"/>
+          <w:left w:val="single" w:sz="4" w:space="4" w:color="B0B0B0"/>
+          <w:bottom w:val="single" w:sz="4" w:space="4" w:color="B0B0B0"/>
+          <w:right w:val="single" w:sz="4" w:space="4" w:color="B0B0B0"/>
+        </w:pBdr>
         <w:shd w:val="clear" w:fill="F2F2F2"/>
+        <w:jc w:val="left"/>
       </w:pPr>
       <w:r>
         <w:rPr>
@@ -1974,6 +2531,7 @@
       <w:r>
         <w:rPr>
           <w:rFonts w:ascii="Courier New" w:hAnsi="Courier New"/>
+          <w:sz w:val="18"/>
         </w:rPr>
         <w:br/>
       </w:r>
@@ -1987,6 +2545,7 @@
       <w:r>
         <w:rPr>
           <w:rFonts w:ascii="Courier New" w:hAnsi="Courier New"/>
+          <w:sz w:val="18"/>
         </w:rPr>
         <w:br/>
       </w:r>
@@ -2000,6 +2559,7 @@
       <w:r>
         <w:rPr>
           <w:rFonts w:ascii="Courier New" w:hAnsi="Courier New"/>
+          <w:sz w:val="18"/>
         </w:rPr>
         <w:br/>
       </w:r>
@@ -2013,6 +2573,7 @@
       <w:r>
         <w:rPr>
           <w:rFonts w:ascii="Courier New" w:hAnsi="Courier New"/>
+          <w:sz w:val="18"/>
         </w:rPr>
         <w:br/>
       </w:r>
@@ -2026,6 +2587,7 @@
       <w:r>
         <w:rPr>
           <w:rFonts w:ascii="Courier New" w:hAnsi="Courier New"/>
+          <w:sz w:val="18"/>
         </w:rPr>
         <w:br/>
       </w:r>
@@ -2039,6 +2601,7 @@
       <w:r>
         <w:rPr>
           <w:rFonts w:ascii="Courier New" w:hAnsi="Courier New"/>
+          <w:sz w:val="18"/>
         </w:rPr>
         <w:br/>
       </w:r>
@@ -2052,6 +2615,7 @@
       <w:r>
         <w:rPr>
           <w:rFonts w:ascii="Courier New" w:hAnsi="Courier New"/>
+          <w:sz w:val="18"/>
         </w:rPr>
         <w:br/>
       </w:r>
@@ -2065,6 +2629,7 @@
       <w:r>
         <w:rPr>
           <w:rFonts w:ascii="Courier New" w:hAnsi="Courier New"/>
+          <w:sz w:val="18"/>
         </w:rPr>
         <w:br/>
       </w:r>
@@ -2078,6 +2643,7 @@
       <w:r>
         <w:rPr>
           <w:rFonts w:ascii="Courier New" w:hAnsi="Courier New"/>
+          <w:sz w:val="18"/>
         </w:rPr>
         <w:br/>
       </w:r>
@@ -2091,6 +2657,7 @@
       <w:r>
         <w:rPr>
           <w:rFonts w:ascii="Courier New" w:hAnsi="Courier New"/>
+          <w:sz w:val="18"/>
         </w:rPr>
         <w:br/>
       </w:r>
@@ -2104,6 +2671,7 @@
       <w:r>
         <w:rPr>
           <w:rFonts w:ascii="Courier New" w:hAnsi="Courier New"/>
+          <w:sz w:val="18"/>
         </w:rPr>
         <w:br/>
       </w:r>
@@ -2124,12 +2692,14 @@
     </w:p>
     <w:p>
       <w:pPr>
-        <w:spacing w:before="200" w:after="100"/>
+        <w:keepNext/>
+        <w:spacing w:before="240" w:after="120"/>
+        <w:jc w:val="left"/>
       </w:pPr>
       <w:r>
         <w:rPr>
           <w:b/>
-          <w:sz w:val="28"/>
+          <w:sz w:val="30"/>
         </w:rPr>
         <w:t xml:space="preserve">10. PIO VA DMA O'RTASIDAGI 20 TA ASOSIY FARQ (RO'YXAT)</w:t>
       </w:r>
@@ -2276,12 +2846,14 @@
     </w:p>
     <w:p>
       <w:pPr>
-        <w:spacing w:before="200" w:after="100"/>
+        <w:keepNext/>
+        <w:spacing w:before="240" w:after="120"/>
+        <w:jc w:val="left"/>
       </w:pPr>
       <w:r>
         <w:rPr>
           <w:b/>
-          <w:sz w:val="28"/>
+          <w:sz w:val="30"/>
         </w:rPr>
         <w:t xml:space="preserve">11. AMALIY MISOL (PSEVDOKOD)</w:t>
       </w:r>
@@ -2297,8 +2869,15 @@
     </w:p>
     <w:p>
       <w:pPr>
-        <w:spacing w:after="120"/>
+        <w:spacing w:after="160" w:line="240" w:lineRule="auto"/>
+        <w:pBdr>
+          <w:top w:val="single" w:sz="4" w:space="4" w:color="B0B0B0"/>
+          <w:left w:val="single" w:sz="4" w:space="4" w:color="B0B0B0"/>
+          <w:bottom w:val="single" w:sz="4" w:space="4" w:color="B0B0B0"/>
+          <w:right w:val="single" w:sz="4" w:space="4" w:color="B0B0B0"/>
+        </w:pBdr>
         <w:shd w:val="clear" w:fill="F2F2F2"/>
+        <w:jc w:val="left"/>
       </w:pPr>
       <w:r>
         <w:rPr>
@@ -2310,6 +2889,7 @@
       <w:r>
         <w:rPr>
           <w:rFonts w:ascii="Courier New" w:hAnsi="Courier New"/>
+          <w:sz w:val="18"/>
         </w:rPr>
         <w:br/>
       </w:r>
@@ -2323,6 +2903,7 @@
       <w:r>
         <w:rPr>
           <w:rFonts w:ascii="Courier New" w:hAnsi="Courier New"/>
+          <w:sz w:val="18"/>
         </w:rPr>
         <w:br/>
       </w:r>
@@ -2336,6 +2917,7 @@
       <w:r>
         <w:rPr>
           <w:rFonts w:ascii="Courier New" w:hAnsi="Courier New"/>
+          <w:sz w:val="18"/>
         </w:rPr>
         <w:br/>
       </w:r>
@@ -2349,6 +2931,7 @@
       <w:r>
         <w:rPr>
           <w:rFonts w:ascii="Courier New" w:hAnsi="Courier New"/>
+          <w:sz w:val="18"/>
         </w:rPr>
         <w:br/>
       </w:r>
@@ -2362,6 +2945,7 @@
       <w:r>
         <w:rPr>
           <w:rFonts w:ascii="Courier New" w:hAnsi="Courier New"/>
+          <w:sz w:val="18"/>
         </w:rPr>
         <w:br/>
       </w:r>
@@ -2375,6 +2959,7 @@
       <w:r>
         <w:rPr>
           <w:rFonts w:ascii="Courier New" w:hAnsi="Courier New"/>
+          <w:sz w:val="18"/>
         </w:rPr>
         <w:br/>
       </w:r>
@@ -2388,6 +2973,7 @@
       <w:r>
         <w:rPr>
           <w:rFonts w:ascii="Courier New" w:hAnsi="Courier New"/>
+          <w:sz w:val="18"/>
         </w:rPr>
         <w:br/>
       </w:r>
@@ -2401,6 +2987,7 @@
       <w:r>
         <w:rPr>
           <w:rFonts w:ascii="Courier New" w:hAnsi="Courier New"/>
+          <w:sz w:val="18"/>
         </w:rPr>
         <w:br/>
       </w:r>
@@ -2414,6 +3001,7 @@
       <w:r>
         <w:rPr>
           <w:rFonts w:ascii="Courier New" w:hAnsi="Courier New"/>
+          <w:sz w:val="18"/>
         </w:rPr>
         <w:br/>
       </w:r>
@@ -2436,8 +3024,15 @@
     </w:p>
     <w:p>
       <w:pPr>
-        <w:spacing w:after="120"/>
+        <w:spacing w:after="160" w:line="240" w:lineRule="auto"/>
+        <w:pBdr>
+          <w:top w:val="single" w:sz="4" w:space="4" w:color="B0B0B0"/>
+          <w:left w:val="single" w:sz="4" w:space="4" w:color="B0B0B0"/>
+          <w:bottom w:val="single" w:sz="4" w:space="4" w:color="B0B0B0"/>
+          <w:right w:val="single" w:sz="4" w:space="4" w:color="B0B0B0"/>
+        </w:pBdr>
         <w:shd w:val="clear" w:fill="F2F2F2"/>
+        <w:jc w:val="left"/>
       </w:pPr>
       <w:r>
         <w:rPr>
@@ -2449,6 +3044,7 @@
       <w:r>
         <w:rPr>
           <w:rFonts w:ascii="Courier New" w:hAnsi="Courier New"/>
+          <w:sz w:val="18"/>
         </w:rPr>
         <w:br/>
       </w:r>
@@ -2462,6 +3058,7 @@
       <w:r>
         <w:rPr>
           <w:rFonts w:ascii="Courier New" w:hAnsi="Courier New"/>
+          <w:sz w:val="18"/>
         </w:rPr>
         <w:br/>
       </w:r>
@@ -2475,6 +3072,7 @@
       <w:r>
         <w:rPr>
           <w:rFonts w:ascii="Courier New" w:hAnsi="Courier New"/>
+          <w:sz w:val="18"/>
         </w:rPr>
         <w:br/>
       </w:r>
@@ -2488,6 +3086,7 @@
       <w:r>
         <w:rPr>
           <w:rFonts w:ascii="Courier New" w:hAnsi="Courier New"/>
+          <w:sz w:val="18"/>
         </w:rPr>
         <w:br/>
       </w:r>
@@ -2501,6 +3100,7 @@
       <w:r>
         <w:rPr>
           <w:rFonts w:ascii="Courier New" w:hAnsi="Courier New"/>
+          <w:sz w:val="18"/>
         </w:rPr>
         <w:br/>
       </w:r>
@@ -2514,6 +3114,7 @@
       <w:r>
         <w:rPr>
           <w:rFonts w:ascii="Courier New" w:hAnsi="Courier New"/>
+          <w:sz w:val="18"/>
         </w:rPr>
         <w:br/>
       </w:r>
@@ -2527,6 +3128,7 @@
       <w:r>
         <w:rPr>
           <w:rFonts w:ascii="Courier New" w:hAnsi="Courier New"/>
+          <w:sz w:val="18"/>
         </w:rPr>
         <w:br/>
       </w:r>
@@ -2540,6 +3142,7 @@
       <w:r>
         <w:rPr>
           <w:rFonts w:ascii="Courier New" w:hAnsi="Courier New"/>
+          <w:sz w:val="18"/>
         </w:rPr>
         <w:br/>
       </w:r>
@@ -2553,6 +3156,7 @@
       <w:r>
         <w:rPr>
           <w:rFonts w:ascii="Courier New" w:hAnsi="Courier New"/>
+          <w:sz w:val="18"/>
         </w:rPr>
         <w:br/>
       </w:r>
@@ -2566,6 +3170,7 @@
       <w:r>
         <w:rPr>
           <w:rFonts w:ascii="Courier New" w:hAnsi="Courier New"/>
+          <w:sz w:val="18"/>
         </w:rPr>
         <w:br/>
       </w:r>
@@ -2579,6 +3184,7 @@
       <w:r>
         <w:rPr>
           <w:rFonts w:ascii="Courier New" w:hAnsi="Courier New"/>
+          <w:sz w:val="18"/>
         </w:rPr>
         <w:br/>
       </w:r>
@@ -2592,6 +3198,7 @@
       <w:r>
         <w:rPr>
           <w:rFonts w:ascii="Courier New" w:hAnsi="Courier New"/>
+          <w:sz w:val="18"/>
         </w:rPr>
         <w:br/>
       </w:r>
@@ -2605,6 +3212,7 @@
       <w:r>
         <w:rPr>
           <w:rFonts w:ascii="Courier New" w:hAnsi="Courier New"/>
+          <w:sz w:val="18"/>
         </w:rPr>
         <w:br/>
       </w:r>
@@ -2625,12 +3233,14 @@
     </w:p>
     <w:p>
       <w:pPr>
-        <w:spacing w:before="200" w:after="100"/>
+        <w:keepNext/>
+        <w:spacing w:before="240" w:after="120"/>
+        <w:jc w:val="left"/>
       </w:pPr>
       <w:r>
         <w:rPr>
           <w:b/>
-          <w:sz w:val="28"/>
+          <w:sz w:val="30"/>
         </w:rPr>
         <w:t xml:space="preserve">12. XULOSA</w:t>
       </w:r>
@@ -2683,8 +3293,33 @@
     </w:p>
     <w:sectPr>
       <w:pgSz w:w="11906" w:h="16838"/>
-      <w:pgMar w:top="1134" w:right="1134" w:bottom="1134" w:left="1417" w:header="708" w:footer="708" w:gutter="0"/>
+      <w:pgMar w:top="1134" w:right="850" w:bottom="1134" w:left="1701" w:header="708" w:footer="708" w:gutter="0"/>
     </w:sectPr>
   </w:body>
 </w:document>
+</file>
+
+<file path=word/styles.xml><?xml version="1.0" encoding="utf-8"?>
+<w:styles xmlns:w="http://schemas.openxmlformats.org/wordprocessingml/2006/main">
+  <w:docDefaults>
+    <w:rPrDefault>
+      <w:rPr>
+        <w:rFonts w:ascii="Times New Roman" w:hAnsi="Times New Roman" w:cs="Times New Roman"/>
+        <w:sz w:val="28"/>
+        <w:szCs w:val="28"/>
+        <w:lang w:val="en-US"/>
+      </w:rPr>
+    </w:rPrDefault>
+    <w:pPrDefault>
+      <w:pPr>
+        <w:spacing w:after="120" w:line="360" w:lineRule="auto"/>
+        <w:jc w:val="both"/>
+      </w:pPr>
+    </w:pPrDefault>
+  </w:docDefaults>
+  <w:style w:type="paragraph" w:default="1" w:styleId="Normal">
+    <w:name w:val="Normal"/>
+    <w:qFormat/>
+  </w:style>
+</w:styles>
 </file>
</xml_diff>